<commit_message>
Add confirmed Next.js SSR, SCSS, and form skills to the fullstack CV.
Co-authored-by: Mohamed Mostafa <dev.xmuhameed@gmail.com>
</commit_message>
<xml_diff>
--- a/Mohamed_Mostafa-Fullstack_Developer.docx
+++ b/Mohamed_Mostafa-Fullstack_Developer.docx
@@ -93,7 +93,25 @@
           <w:sz w:val="22"/>
           <w:u w:val="none"/>
         </w:rPr>
-        <w:t>Full-Stack Developer with 4+ years of experience building enterprise, event management, and e-commerce applications with React.js, Next.js, Node.js, NestJS, and TypeScript. Delivered 20+ production web applications and platforms serving 100,000+ users, including REST (Representational State Transfer) application programming interfaces (APIs), PostgreSQL data models with Prisma ORM, and Stripe and Tabby payments. Cut load times by up to 25% and grew organic traffic by 20% through performance work and search engine optimization (SEO). Works with cross-functional teams in Agile environments.</w:t>
+        <w:t>Full-Stack Developer with 4+ years of experience building enterprise, event management, and e-commerce applications with React.js, Next.js, Node.js, NestJS, and TypeScript. Uses Next.js server-side rendering (SSR) and the App Router, SCSS (Sass), and React Hook Form with Zod. Delivered 20+ production web applications and platforms serving 100,000+ users, including REST (Representational State Transfer) application programming interfaces (APIs), PostgreSQL data models with Prisma ORM, and Stripe and Tabby payments. Cut load times by up to 25% and grew organic traffic by 20% through performance work and search engine optimization (SEO).</w:t>
+      </w:r>
+    </w:p>
+    <w:p>
+      <w:pPr>
+        <w:keepNext w:val="0"/>
+        <w:keepLines/>
+        <w:spacing w:before="0" w:after="0" w:line="220" w:lineRule="auto"/>
+      </w:pPr>
+      <w:r>
+        <w:rPr>
+          <w:rFonts w:ascii="Arial" w:hAnsi="Arial" w:cs="Arial" w:eastAsia="Arial"/>
+          <w:b w:val="0"/>
+          <w:i w:val="0"/>
+          <w:color w:val="000000"/>
+          <w:sz w:val="22"/>
+          <w:u w:val="none"/>
+        </w:rPr>
+        <w:t>Works with cross-functional Agile teams.</w:t>
       </w:r>
     </w:p>
     <w:p>
@@ -173,7 +191,7 @@
           <w:sz w:val="22"/>
           <w:u w:val="none"/>
         </w:rPr>
-        <w:t>React.js, Next.js, Tailwind CSS, Redux Toolkit and Zustand for state management, Bootstrap, Three.js, responsive web design (HTML and CSS)</w:t>
+        <w:t>React.js, Next.js (server-side rendering (SSR) and App Router), Tailwind CSS, SCSS (Sass), React Hook Form, Zod, Redux Toolkit and Zustand for state management, Bootstrap, Three.js, responsive web design (HTML and CSS)</w:t>
       </w:r>
     </w:p>
     <w:p>
@@ -202,7 +220,7 @@
           <w:sz w:val="22"/>
           <w:u w:val="none"/>
         </w:rPr>
-        <w:t>Node.js, NestJS (Nest.js), Express.js, REST APIs, Prisma ORM (object-relational mapping), secure JSON Web Token (JWT) authentication and authorization</w:t>
+        <w:t>Node.js, NestJS (Nest.js), Express.js, REST APIs, WebSockets (Socket.io), Prisma ORM (object-relational mapping), secure JSON Web Token (JWT) authentication and authorization</w:t>
       </w:r>
     </w:p>
     <w:p>
@@ -260,7 +278,7 @@
           <w:sz w:val="22"/>
           <w:u w:val="none"/>
         </w:rPr>
-        <w:t>Git, GitHub (version control), CI/CD (continuous integration and continuous delivery) with GitHub Actions, Postman, Figma, Stripe, Tabby, Google Analytics, Meta Pixel, Agile</w:t>
+        <w:t>Git, GitHub (version control), CI/CD (continuous integration and continuous delivery) with GitHub Actions, Vercel, Postman, Figma, Stripe, Tabby, Google Analytics, Meta Pixel, Agile</w:t>
       </w:r>
     </w:p>
     <w:p>
@@ -550,7 +568,7 @@
           <w:sz w:val="22"/>
           <w:u w:val="none"/>
         </w:rPr>
-        <w:t>• Built real-time dashboards with NestJS and optimized backend performance for PostgreSQL enterprise systems.</w:t>
+        <w:t>• Built real-time dashboards with NestJS and WebSockets (Socket.io), and optimized backend performance for PostgreSQL enterprise systems.</w:t>
       </w:r>
     </w:p>
     <w:p>

</xml_diff>